<commit_message>
Update the paper to the corrected measurements
Both variants now report SpecGuard recall 0.54 (95% interval 0.41 to 0.66 over
three runs) instead of 0.58, add strict precision to the comparison table,
describe the D8 scoring rule, the rule-id ablation and the oracle confirmation
of 12 of 13 escaping drift cases, and replace the single-run caveats with the
repeated-run intervals. Figure 2 gains bootstrap whiskers.

The .docx files and fig1.png are rebuilt. The .pdf renders are not: LibreOffice
was unavailable, so they still show the earlier numbers (see paper/README.md).

Co-Authored-By: Claude Sonnet 5.5 <noreply@anthropic.com>
</commit_message>
<xml_diff>
--- a/paper/SpecDrift-Bench_IEEE_paper.docx
+++ b/paper/SpecDrift-Bench_IEEE_paper.docx
@@ -247,7 +247,7 @@
         <w:t>Abstract—</w:t>
       </w:r>
       <w:r>
-        <w:t>Large language models now write a substantial share of production code, and they introduce a failure mode that functional testing does not catch: specification drift, in which an implementation quietly stops satisfying a requirement it once met while the project's own test suite continues to pass. Tools that claim to detect drift are evaluated by the issues they report rather than by the issues they miss or invent, so their trustworthiness is unknown. This paper presents SpecDrift-Bench, a fault-injection benchmark and evaluation framework that treats drift detection as a classification problem in which false alarms are weighted as heavily as misses. We define nine drift categories, including comment decoys and reverse-direction unauthorised scope creep, together with three categories of negative control, and construct 86 validated cases by injecting faults into three working Python projects governed by 40 numbered specification rules. Every case records whether the host project's own tests still pass: 22 percent of injected drift escapes testing entirely, and unauthorised scope creep escapes it in every case. We evaluate a two-stage detector, SpecGuard, whose retrieval and verification stages are instrumented separately so that each miss is attributed to one of them, against keyword-matching and whole-file-prompting baselines. Retrieval raises recall from 0.17 to 0.58 but raises the false-alarm rate from 0.04 to 0.63, and the surviving false alarms are confidently wrong rather than unsupported. We conclude that evidence citation alone cannot make an LLM conformance judge trustworthy and that its counterexamples must be executed.</w:t>
+        <w:t>Large language models now write a substantial share of production code, and they introduce a failure mode that functional testing does not catch: specification drift, in which an implementation quietly stops satisfying a requirement it once met while the project's own test suite continues to pass. Tools that claim to detect drift are evaluated by the issues they report rather than by the issues they miss or invent, so their trustworthiness is unknown. This paper presents SpecDrift-Bench, a fault-injection benchmark and evaluation framework that treats drift detection as a classification problem in which false alarms are weighted as heavily as misses. We define nine drift categories, including comment decoys and reverse-direction unauthorised scope creep, together with three categories of negative control, and construct 86 validated cases by injecting faults into three working Python projects governed by 40 numbered specification rules. Every case records whether the host project's own tests still pass: 22 percent of injected drift escapes testing entirely, and unauthorised scope creep escapes it in every case; oracle tests confirm twelve of the thirteen escaping cases as genuine violations. We evaluate a two-stage detector, SpecGuard, whose retrieval and verification stages are instrumented separately so that each miss is attributed to one of them, against keyword-matching and whole-file-prompting baselines. Retrieval raises recall from 0.17 to 0.54 (95 percent interval 0.41 to 0.66 over three runs) but raises the false-alarm rate from 0.04 to 0.63, and the surviving false alarms are confidently wrong rather than unsupported. We conclude that evidence citation alone cannot make an LLM conformance judge trustworthy and that its counterexamples must be executed.</w:t>
       </w:r>
     </w:p>
     <w:p>
@@ -2536,7 +2536,7 @@
         <w:pStyle w:val="BodyText"/>
       </w:pPr>
       <w:r>
-        <w:t>Model responses are cached on a hash of the question, so that only the chunks a case actually modified incur a call: a full 86-case SpecGuard run costs 414 model calls rather than the 1,146 rule-case pairs it covers. Temperature is fixed at zero, retrieval ties are broken by chunk identifier, and every result file records the model identifier used. A deterministic offline provider ships as the default so that the pipeline, the demonstration and the dashboard run with no API key; it is not a model, and the framework prints a warning whenever it is active.</w:t>
+        <w:t>Model responses are cached on a hash of the question, so that only the chunks a case actually modified incur a call: the recorded SpecGuard run made 252 model calls for the 1,146 rule-case pairs it covers, the rest being answered from a cache warmed by earlier runs. Temperature is fixed at zero, retrieval ties are broken by chunk identifier, and every result file records the model identifier used. A deterministic offline provider ships as the default so that the pipeline, the demonstration and the dashboard run with no API key; it is not a model, and the framework prints a warning whenever it is active.</w:t>
       </w:r>
     </w:p>
     <w:p>
@@ -2568,7 +2568,7 @@
         <w:pStyle w:val="bulletlist"/>
       </w:pPr>
       <w:r>
-        <w:t>D8 cases name no target rule, since no rule authorises the added behaviour, so any drift flag on the case counts as a catch.</w:t>
+        <w:t>D8 cases name no target rule, since no rule authorises the added behaviour, so a drift flag counts as a catch only if it was raised while the detector was shown the planted code, or cites its file; a flag raised elsewhere is spurious.</w:t>
       </w:r>
     </w:p>
     <w:p>
@@ -2576,6 +2576,14 @@
         <w:pStyle w:val="bulletlist"/>
       </w:pPr>
       <w:r>
+        <w:t>Precision is reported twice: conventionally, over false alarms on negative controls, and strictly, which additionally charges every spurious flag as a false positive.</w:t>
+      </w:r>
+    </w:p>
+    <w:p>
+      <w:pPr>
+        <w:pStyle w:val="bulletlist"/>
+      </w:pPr>
+      <w:r>
         <w:t>Any drift flag on a negative control is a false alarm. The false-alarm rate is reported alongside precision rather than folded into it.</w:t>
       </w:r>
     </w:p>
@@ -2608,7 +2616,7 @@
         <w:pStyle w:val="BodyText"/>
       </w:pPr>
       <w:r>
-        <w:t>Results are reported from a single run of each detector over all 86 cases with gpt-4o-mini at temperature zero, supplemented by the retrieval and keyword measurements reproduced for this paper. They are preliminary at n equal to 1; they are reported because their shape, not their precision, is the finding.</w:t>
+        <w:t>SpecGuard was run three times over all 86 cases with gpt-4o-mini at temperature zero, and the whole-file and keyword baselines once; the tables show run 1. Intervals are bootstrap 95 percent intervals that resample cases and pool every run, so they cover both model and case-sampling variation. The retrieval and keyword measurements were reproduced for this paper.</w:t>
       </w:r>
     </w:p>
     <w:p>
@@ -2704,7 +2712,7 @@
         <w:keepNext/>
       </w:pPr>
       <w:r>
-        <w:t>End-to-End Detector Comparison (n = 1, Temperature 0)</w:t>
+        <w:t>End-to-End Detector Comparison (Run 1, Temperature 0)</w:t>
       </w:r>
     </w:p>
     <w:tbl>
@@ -2723,21 +2731,22 @@
           <w:insideH w:val="single" w:sz="4" w:space="0" w:color="auto"/>
           <w:insideV w:val="single" w:sz="4" w:space="0" w:color="auto"/>
         </w:tblBorders>
-        <w:tblW w:w="4680" w:type="dxa"/>
+        <w:tblW w:w="4435" w:type="dxa"/>
       </w:tblPr>
       <w:tblGrid>
-        <w:gridCol w:w="1224"/>
-        <w:gridCol w:w="504"/>
-        <w:gridCol w:w="504"/>
-        <w:gridCol w:w="504"/>
-        <w:gridCol w:w="648"/>
-        <w:gridCol w:w="648"/>
-        <w:gridCol w:w="648"/>
+        <w:gridCol w:w="1152"/>
+        <w:gridCol w:w="432"/>
+        <w:gridCol w:w="432"/>
+        <w:gridCol w:w="432"/>
+        <w:gridCol w:w="432"/>
+        <w:gridCol w:w="518"/>
+        <w:gridCol w:w="518"/>
+        <w:gridCol w:w="518"/>
       </w:tblGrid>
       <w:tr>
         <w:tc>
           <w:tcPr>
-            <w:tcW w:type="dxa" w:w="1224"/>
+            <w:tcW w:type="dxa" w:w="1152"/>
           </w:tcPr>
           <w:p>
             <w:pPr>
@@ -2752,7 +2761,7 @@
         </w:tc>
         <w:tc>
           <w:tcPr>
-            <w:tcW w:type="dxa" w:w="504"/>
+            <w:tcW w:type="dxa" w:w="432"/>
           </w:tcPr>
           <w:p>
             <w:pPr>
@@ -2767,7 +2776,7 @@
         </w:tc>
         <w:tc>
           <w:tcPr>
-            <w:tcW w:type="dxa" w:w="504"/>
+            <w:tcW w:type="dxa" w:w="432"/>
           </w:tcPr>
           <w:p>
             <w:pPr>
@@ -2776,13 +2785,28 @@
               <w:jc w:val="center"/>
             </w:pPr>
             <w:r>
+              <w:t>SP</w:t>
+            </w:r>
+          </w:p>
+        </w:tc>
+        <w:tc>
+          <w:tcPr>
+            <w:tcW w:type="dxa" w:w="432"/>
+          </w:tcPr>
+          <w:p>
+            <w:pPr>
+              <w:pStyle w:val="tablecolhead"/>
+              <w:keepNext/>
+              <w:jc w:val="center"/>
+            </w:pPr>
+            <w:r>
               <w:t>R</w:t>
             </w:r>
           </w:p>
         </w:tc>
         <w:tc>
           <w:tcPr>
-            <w:tcW w:type="dxa" w:w="504"/>
+            <w:tcW w:type="dxa" w:w="432"/>
           </w:tcPr>
           <w:p>
             <w:pPr>
@@ -2797,7 +2821,7 @@
         </w:tc>
         <w:tc>
           <w:tcPr>
-            <w:tcW w:type="dxa" w:w="648"/>
+            <w:tcW w:type="dxa" w:w="518"/>
           </w:tcPr>
           <w:p>
             <w:pPr>
@@ -2812,7 +2836,7 @@
         </w:tc>
         <w:tc>
           <w:tcPr>
-            <w:tcW w:type="dxa" w:w="648"/>
+            <w:tcW w:type="dxa" w:w="518"/>
           </w:tcPr>
           <w:p>
             <w:pPr>
@@ -2827,7 +2851,7 @@
         </w:tc>
         <w:tc>
           <w:tcPr>
-            <w:tcW w:type="dxa" w:w="648"/>
+            <w:tcW w:type="dxa" w:w="518"/>
           </w:tcPr>
           <w:p>
             <w:pPr>
@@ -2844,7 +2868,7 @@
       <w:tr>
         <w:tc>
           <w:tcPr>
-            <w:tcW w:type="dxa" w:w="1224"/>
+            <w:tcW w:type="dxa" w:w="1152"/>
           </w:tcPr>
           <w:p>
             <w:pPr>
@@ -2859,52 +2883,67 @@
         </w:tc>
         <w:tc>
           <w:tcPr>
-            <w:tcW w:type="dxa" w:w="504"/>
-          </w:tcPr>
-          <w:p>
-            <w:pPr>
-              <w:pStyle w:val="tablecopy"/>
-              <w:keepNext/>
-              <w:jc w:val="center"/>
-            </w:pPr>
-            <w:r>
-              <w:t>0.67</w:t>
-            </w:r>
-          </w:p>
-        </w:tc>
-        <w:tc>
-          <w:tcPr>
-            <w:tcW w:type="dxa" w:w="504"/>
-          </w:tcPr>
-          <w:p>
-            <w:pPr>
-              <w:pStyle w:val="tablecopy"/>
-              <w:keepNext/>
-              <w:jc w:val="center"/>
-            </w:pPr>
-            <w:r>
-              <w:t>0.58</w:t>
-            </w:r>
-          </w:p>
-        </w:tc>
-        <w:tc>
-          <w:tcPr>
-            <w:tcW w:type="dxa" w:w="504"/>
-          </w:tcPr>
-          <w:p>
-            <w:pPr>
-              <w:pStyle w:val="tablecopy"/>
-              <w:keepNext/>
-              <w:jc w:val="center"/>
-            </w:pPr>
-            <w:r>
-              <w:t>0.62</w:t>
-            </w:r>
-          </w:p>
-        </w:tc>
-        <w:tc>
-          <w:tcPr>
-            <w:tcW w:type="dxa" w:w="648"/>
+            <w:tcW w:type="dxa" w:w="432"/>
+          </w:tcPr>
+          <w:p>
+            <w:pPr>
+              <w:pStyle w:val="tablecopy"/>
+              <w:keepNext/>
+              <w:jc w:val="center"/>
+            </w:pPr>
+            <w:r>
+              <w:t>0.65</w:t>
+            </w:r>
+          </w:p>
+        </w:tc>
+        <w:tc>
+          <w:tcPr>
+            <w:tcW w:type="dxa" w:w="432"/>
+          </w:tcPr>
+          <w:p>
+            <w:pPr>
+              <w:pStyle w:val="tablecopy"/>
+              <w:keepNext/>
+              <w:jc w:val="center"/>
+            </w:pPr>
+            <w:r>
+              <w:t>0.29</w:t>
+            </w:r>
+          </w:p>
+        </w:tc>
+        <w:tc>
+          <w:tcPr>
+            <w:tcW w:type="dxa" w:w="432"/>
+          </w:tcPr>
+          <w:p>
+            <w:pPr>
+              <w:pStyle w:val="tablecopy"/>
+              <w:keepNext/>
+              <w:jc w:val="center"/>
+            </w:pPr>
+            <w:r>
+              <w:t>0.54</w:t>
+            </w:r>
+          </w:p>
+        </w:tc>
+        <w:tc>
+          <w:tcPr>
+            <w:tcW w:type="dxa" w:w="432"/>
+          </w:tcPr>
+          <w:p>
+            <w:pPr>
+              <w:pStyle w:val="tablecopy"/>
+              <w:keepNext/>
+              <w:jc w:val="center"/>
+            </w:pPr>
+            <w:r>
+              <w:t>0.59</w:t>
+            </w:r>
+          </w:p>
+        </w:tc>
+        <w:tc>
+          <w:tcPr>
+            <w:tcW w:type="dxa" w:w="518"/>
           </w:tcPr>
           <w:p>
             <w:pPr>
@@ -2919,7 +2958,7 @@
         </w:tc>
         <w:tc>
           <w:tcPr>
-            <w:tcW w:type="dxa" w:w="648"/>
+            <w:tcW w:type="dxa" w:w="518"/>
           </w:tcPr>
           <w:p>
             <w:pPr>
@@ -2934,7 +2973,7 @@
         </w:tc>
         <w:tc>
           <w:tcPr>
-            <w:tcW w:type="dxa" w:w="648"/>
+            <w:tcW w:type="dxa" w:w="518"/>
           </w:tcPr>
           <w:p>
             <w:pPr>
@@ -2951,7 +2990,7 @@
       <w:tr>
         <w:tc>
           <w:tcPr>
-            <w:tcW w:type="dxa" w:w="1224"/>
+            <w:tcW w:type="dxa" w:w="1152"/>
           </w:tcPr>
           <w:p>
             <w:pPr>
@@ -2966,7 +3005,7 @@
         </w:tc>
         <w:tc>
           <w:tcPr>
-            <w:tcW w:type="dxa" w:w="504"/>
+            <w:tcW w:type="dxa" w:w="432"/>
           </w:tcPr>
           <w:p>
             <w:pPr>
@@ -2981,7 +3020,22 @@
         </w:tc>
         <w:tc>
           <w:tcPr>
-            <w:tcW w:type="dxa" w:w="504"/>
+            <w:tcW w:type="dxa" w:w="432"/>
+          </w:tcPr>
+          <w:p>
+            <w:pPr>
+              <w:pStyle w:val="tablecopy"/>
+              <w:keepNext/>
+              <w:jc w:val="center"/>
+            </w:pPr>
+            <w:r>
+              <w:t>0.83</w:t>
+            </w:r>
+          </w:p>
+        </w:tc>
+        <w:tc>
+          <w:tcPr>
+            <w:tcW w:type="dxa" w:w="432"/>
           </w:tcPr>
           <w:p>
             <w:pPr>
@@ -2996,7 +3050,7 @@
         </w:tc>
         <w:tc>
           <w:tcPr>
-            <w:tcW w:type="dxa" w:w="504"/>
+            <w:tcW w:type="dxa" w:w="432"/>
           </w:tcPr>
           <w:p>
             <w:pPr>
@@ -3011,7 +3065,7 @@
         </w:tc>
         <w:tc>
           <w:tcPr>
-            <w:tcW w:type="dxa" w:w="648"/>
+            <w:tcW w:type="dxa" w:w="518"/>
           </w:tcPr>
           <w:p>
             <w:pPr>
@@ -3026,7 +3080,7 @@
         </w:tc>
         <w:tc>
           <w:tcPr>
-            <w:tcW w:type="dxa" w:w="648"/>
+            <w:tcW w:type="dxa" w:w="518"/>
           </w:tcPr>
           <w:p>
             <w:pPr>
@@ -3041,7 +3095,7 @@
         </w:tc>
         <w:tc>
           <w:tcPr>
-            <w:tcW w:type="dxa" w:w="648"/>
+            <w:tcW w:type="dxa" w:w="518"/>
           </w:tcPr>
           <w:p>
             <w:pPr>
@@ -3058,7 +3112,7 @@
       <w:tr>
         <w:tc>
           <w:tcPr>
-            <w:tcW w:type="dxa" w:w="1224"/>
+            <w:tcW w:type="dxa" w:w="1152"/>
           </w:tcPr>
           <w:p>
             <w:pPr>
@@ -3073,7 +3127,7 @@
         </w:tc>
         <w:tc>
           <w:tcPr>
-            <w:tcW w:type="dxa" w:w="504"/>
+            <w:tcW w:type="dxa" w:w="432"/>
           </w:tcPr>
           <w:p>
             <w:pPr>
@@ -3088,7 +3142,7 @@
         </w:tc>
         <w:tc>
           <w:tcPr>
-            <w:tcW w:type="dxa" w:w="504"/>
+            <w:tcW w:type="dxa" w:w="432"/>
           </w:tcPr>
           <w:p>
             <w:pPr>
@@ -3097,13 +3151,28 @@
               <w:jc w:val="center"/>
             </w:pPr>
             <w:r>
+              <w:t>0.16</w:t>
+            </w:r>
+          </w:p>
+        </w:tc>
+        <w:tc>
+          <w:tcPr>
+            <w:tcW w:type="dxa" w:w="432"/>
+          </w:tcPr>
+          <w:p>
+            <w:pPr>
+              <w:pStyle w:val="tablecopy"/>
+              <w:keepNext w:val="0"/>
+              <w:jc w:val="center"/>
+            </w:pPr>
+            <w:r>
               <w:t>0.08</w:t>
             </w:r>
           </w:p>
         </w:tc>
         <w:tc>
           <w:tcPr>
-            <w:tcW w:type="dxa" w:w="504"/>
+            <w:tcW w:type="dxa" w:w="432"/>
           </w:tcPr>
           <w:p>
             <w:pPr>
@@ -3118,7 +3187,7 @@
         </w:tc>
         <w:tc>
           <w:tcPr>
-            <w:tcW w:type="dxa" w:w="648"/>
+            <w:tcW w:type="dxa" w:w="518"/>
           </w:tcPr>
           <w:p>
             <w:pPr>
@@ -3133,7 +3202,7 @@
         </w:tc>
         <w:tc>
           <w:tcPr>
-            <w:tcW w:type="dxa" w:w="648"/>
+            <w:tcW w:type="dxa" w:w="518"/>
           </w:tcPr>
           <w:p>
             <w:pPr>
@@ -3148,7 +3217,7 @@
         </w:tc>
         <w:tc>
           <w:tcPr>
-            <w:tcW w:type="dxa" w:w="648"/>
+            <w:tcW w:type="dxa" w:w="518"/>
           </w:tcPr>
           <w:p>
             <w:pPr>
@@ -3175,7 +3244,7 @@
       <w:r>
         <w:drawing>
           <wp:inline xmlns:a="http://schemas.openxmlformats.org/drawingml/2006/main" xmlns:pic="http://schemas.openxmlformats.org/drawingml/2006/picture">
-            <wp:extent cx="2971800" cy="1882140"/>
+            <wp:extent cx="2971800" cy="1879474"/>
             <wp:docPr id="2" name="Picture 2"/>
             <wp:cNvGraphicFramePr>
               <a:graphicFrameLocks noChangeAspect="1"/>
@@ -3196,7 +3265,7 @@
                   <pic:spPr>
                     <a:xfrm>
                       <a:off x="0" y="0"/>
-                      <a:ext cx="2971800" cy="1882140"/>
+                      <a:ext cx="2971800" cy="1879474"/>
                     </a:xfrm>
                     <a:prstGeom prst="rect"/>
                   </pic:spPr>
@@ -3212,7 +3281,7 @@
         <w:pStyle w:val="figurecaption"/>
       </w:pPr>
       <w:r>
-        <w:t xml:space="preserve"> End-to-end detector comparison. The two LLM-based detectors fail in opposite directions: retrieval buys recall and pays for it in false alarms.</w:t>
+        <w:t xml:space="preserve"> End-to-end detector comparison; bars are run 1, whiskers 95% bootstrap intervals. The two LLM-based detectors fail in opposite directions: retrieval buys recall and pays for it in false alarms.</w:t>
       </w:r>
     </w:p>
     <w:p>
@@ -3220,7 +3289,7 @@
         <w:pStyle w:val="BodyText"/>
       </w:pPr>
       <w:r>
-        <w:t>The two LLM-based detectors fail in opposite directions, and the comparison between them is the clearest result in the paper, because they differ only in whether a retrieval stage is present. Retrieval more than triples recall, from 0.17 to 0.58. Showing the model a short, relevant excerpt is what lets it see a violation at all. The same intervention raises the false-alarm rate from 0.04 to 0.63: SpecGuard flags nearly two thirds of the untouched and semantics-preserving controls. Whole-file prompting is quiet and precise and largely blind, missing five of the nine drift categories outright.</w:t>
+        <w:t>The two LLM-based detectors fail in opposite directions, and the comparison between them is the clearest result in the paper, because they differ only in whether a retrieval stage is present. Retrieval more than triples recall, from 0.17 to 0.54, and SpecGuard's interval of 0.41 to 0.66 lies clear of the whole-file baseline's 0.08 to 0.27. Showing the model a short, relevant excerpt is what lets it see a violation at all. The same intervention raises the false-alarm rate from 0.04 to 0.63: SpecGuard flags nearly two thirds of the untouched and semantics-preserving controls. Whole-file prompting is quiet and precise and largely blind, missing four of the nine drift categories outright. The blindness is not a token-budget artefact: every cached whole-file reply answered every rule, the longest at about 900 tokens against a 6,000-token cap.</w:t>
       </w:r>
     </w:p>
     <w:p>
@@ -3228,7 +3297,15 @@
         <w:pStyle w:val="BodyText"/>
       </w:pPr>
       <w:r>
-        <w:t>The keyword baseline establishes the floor: recall 0.08, false-alarm rate 0.37. It is both deaf and noisy, which is the expected signature of vocabulary matching, and it produced 18 spurious flags on rules no injection touched. Per category it scores zero recall on weakened conditions, sequence violations, error-handling drift, comment decoys and output contract drift, and never exceeds 0.22 on any category.</w:t>
+        <w:t>Two results qualify the table. Strict precision, which charges every flag on a non-target rule, is 0.29 for SpecGuard against 0.65 conventionally: most of its flags on drifted cases land on the wrong rule. And the intervals are wide for a reason other than model noise. SpecGuard's recall was identical in all three runs and only 5 percent of cases changed outcome, so the uncertainty comes from having 86 cases. Precision intervals overlap between detectors, and with six to nine cases per category only value drift and weakened conditions are clearly separated from the rest.</w:t>
+      </w:r>
+    </w:p>
+    <w:p>
+      <w:pPr>
+        <w:pStyle w:val="BodyText"/>
+      </w:pPr>
+      <w:r>
+        <w:t>The keyword baseline establishes the floor: recall 0.08, false-alarm rate 0.37. It is both deaf and noisy, which is the expected signature of vocabulary matching, and it produced 17 spurious flags on rules no injection touched. Per category it scores zero recall on weakened conditions, sequence violations, error-handling drift, comment decoys and output contract drift, and never exceeds 0.22 on any category.</w:t>
       </w:r>
     </w:p>
     <w:p>
@@ -3372,7 +3449,7 @@
         <w:pStyle w:val="BodyText"/>
       </w:pPr>
       <w:r>
-        <w:t>Construct validity. Reported detector results come from a single run of one model, gpt-4o-mini, at temperature zero. LLM judgement is non-deterministic even so, and no variance is reported here; the differences between detectors are large enough that their direction is unlikely to reverse, but their magnitudes should be read as provisional. Retrieval results use a deterministic local hashing embedder rather than a trained sentence encoder [8], [9], so Stage 1 numbers are a lower bound.</w:t>
+        <w:t>Construct validity. SpecGuard results come from three runs of one model, gpt-4o-mini, at temperature zero; the baselines were run once, so their intervals reflect case sampling only. The host projects annotate code with the rule it implements, which real code does not. Stripping the annotations leaves the LLM detectors unchanged (SpecGuard recall 0.58 without them, 0.54 with, inside its interval) but raises the keyword baseline's false-alarm rate from 0.37 to 1.00, so that baseline's numbers are partly an artefact of the annotations. Drift labels are checked for the cases that matter: oracle tests confirm twelve of the thirteen escaping cases, and the thirteenth, a change of rounding mode the specification does not constrain, is retained as unconfirmed. Retrieval results use a deterministic local hashing embedder rather than a trained sentence encoder [8], [9], so Stage 1 numbers are a lower bound.</w:t>
       </w:r>
     </w:p>
     <w:p>
@@ -3380,7 +3457,7 @@
         <w:pStyle w:val="BodyText"/>
       </w:pPr>
       <w:r>
-        <w:t>Conclusion validity. Scoring requires a flag to name the targeted rule, which is stricter than case-level detection and depresses recall relative to evaluations that count any flag on a drifted file. We regard the stricter measure as the one that matches how a reviewer would use the output.</w:t>
+        <w:t>Conclusion validity. Scoring requires a flag to name the targeted rule, which is stricter than case-level detection (for D8, the flag must be raised on the planted code) and depresses recall relative to evaluations that count any flag on a drifted file. We regard the stricter measure as the one that matches how a reviewer would use the output.</w:t>
       </w:r>
     </w:p>
     <w:p>
@@ -3396,7 +3473,7 @@
         <w:pStyle w:val="BodyText"/>
       </w:pPr>
       <w:r>
-        <w:t>SpecDrift-Bench measures what the drift-detection literature has reported around: not how many issues a checker raises, but how many it misses, how many it invents, and in which categories. On 86 validated cases the answer for a retrieval-augmented LLM detector is a recall of 0.58 bought at a false-alarm rate of 0.63, with the remaining false alarms confidently argued rather than unsupported. Twenty-two percent of the injected drift passes the host projects' own tests, and unauthorised scope creep passes them always, so the problem the detector addresses is real even though the detector is not yet trustworthy.</w:t>
+        <w:t>SpecDrift-Bench measures what the drift-detection literature has reported around: not how many issues a checker raises, but how many it misses, how many it invents, and in which categories. On 86 validated cases the answer for a retrieval-augmented LLM detector is a recall of 0.54 (interval 0.41 to 0.66) bought at a false-alarm rate of 0.63, with the remaining false alarms confidently argued rather than unsupported. Twenty-two percent of the injected drift passes the host projects' own tests, and unauthorised scope creep passes them always, so the problem the detector addresses is real even though the detector is not yet trustworthy.</w:t>
       </w:r>
     </w:p>
     <w:p>
@@ -3404,7 +3481,7 @@
         <w:pStyle w:val="BodyText"/>
       </w:pPr>
       <w:r>
-        <w:t>Four extensions are scheduled, each with a slot already present in the framework. An adversarial second pass will execute the counterexample attached to every drift verdict and retain the verdict only if the code behaves as alleged, which directly targets the failure characterised in Section VI-D. A reverse-direction authorisation pass will iterate over code looking for an authorising rule, rather than over rules looking for code, which is the only way to lift D8 retrieval above 0.33. Repeated runs across model scales, with Semcheck added as a third baseline, will replace single-run point estimates with variance. And confidence calibration will be measured to derive the abstention threshold that deployment requires. The benchmark will be expanded to ten host projects and approximately 250 cases over the same taxonomy.</w:t>
+        <w:t>Four extensions are scheduled, each with a slot already present in the framework. An adversarial second pass will execute the counterexample attached to every drift verdict and retain the verdict only if the code behaves as alleged, which directly targets the failure characterised in Section VI-D. A reverse-direction authorisation pass will iterate over code looking for an authorising rule, rather than over rules looking for code, which is the only way to lift D8 retrieval above 0.33. Repeated runs across model scales, with Semcheck added as a third baseline, will extend the repeated-run intervals to every detector. And confidence calibration will be measured to derive the abstention threshold that deployment requires. The benchmark will be expanded to ten host projects and approximately 250 cases over the same taxonomy.</w:t>
       </w:r>
     </w:p>
     <w:p>

</xml_diff>

<commit_message>
Describe the reverse-direction check in the paper
Both variants now present the reverse pass as built instead of future work: a Reverse-
Direction Pass subsection (the inversion, the quote gate, the accepted baseline, and the
single prompt adjustment), Reverse and Both rows in the detector comparison table, a results
passage (D8 recall 0.17 to 0.78 over three runs, overlapping intervals overall, six cases),
the scoring rule for reverse findings, the tuning and function-only limits under validity,
and a conclusion that now schedules three extensions rather than four.

The .docx files are rebuilt. The .pdf renders are not (LibreOffice is unavailable), and the
page counts are unchecked: the added text may push either variant over its limit.

Co-Authored-By: Claude Sonnet 5.5 <noreply@anthropic.com>
</commit_message>
<xml_diff>
--- a/paper/SpecDrift-Bench_IEEE_paper.docx
+++ b/paper/SpecDrift-Bench_IEEE_paper.docx
@@ -247,7 +247,7 @@
         <w:t>Abstract—</w:t>
       </w:r>
       <w:r>
-        <w:t>Large language models now write a substantial share of production code, and they introduce a failure mode that functional testing does not catch: specification drift, in which an implementation quietly stops satisfying a requirement it once met while the project's own test suite continues to pass. Tools that claim to detect drift are evaluated by the issues they report rather than by the issues they miss or invent, so their trustworthiness is unknown. This paper presents SpecDrift-Bench, a fault-injection benchmark and evaluation framework that treats drift detection as a classification problem in which false alarms are weighted as heavily as misses. We define nine drift categories, including comment decoys and reverse-direction unauthorised scope creep, together with three categories of negative control, and construct 86 validated cases by injecting faults into three working Python projects governed by 40 numbered specification rules. Every case records whether the host project's own tests still pass: 22 percent of injected drift escapes testing entirely, and unauthorised scope creep escapes it in every case; oracle tests confirm twelve of the thirteen escaping cases as genuine violations. We evaluate a two-stage detector, SpecGuard, whose retrieval and verification stages are instrumented separately so that each miss is attributed to one of them, against keyword-matching and whole-file-prompting baselines. Retrieval raises recall from 0.17 to 0.54 (95 percent interval 0.41 to 0.66 over three runs) but raises the false-alarm rate from 0.04 to 0.63, and the surviving false alarms are confidently wrong rather than unsupported. We conclude that evidence citation alone cannot make an LLM conformance judge trustworthy and that its counterexamples must be executed.</w:t>
+        <w:t>Large language models now write a substantial share of production code, and they introduce a failure mode that functional testing does not catch: specification drift, in which an implementation quietly stops satisfying a requirement it once met while the project's own test suite continues to pass. Tools that claim to detect drift are evaluated by the issues they report rather than by the issues they miss or invent, so their trustworthiness is unknown. This paper presents SpecDrift-Bench, a fault-injection benchmark and evaluation framework that treats drift detection as a classification problem in which false alarms are weighted as heavily as misses. We define nine drift categories, including comment decoys and reverse-direction unauthorised scope creep, together with three categories of negative control, and construct 86 validated cases by injecting faults into three working Python projects governed by 40 numbered specification rules. Every case records whether the host project's own tests still pass: 22 percent of injected drift escapes testing entirely, and unauthorised scope creep escapes it in every case; oracle tests confirm twelve of the thirteen escaping cases as genuine violations. We evaluate a two-stage detector, SpecGuard, whose retrieval and verification stages are instrumented separately so that each miss is attributed to one of them, against keyword-matching and whole-file-prompting baselines. Retrieval raises recall from 0.17 to 0.54 (95 percent interval 0.41 to 0.66 over three runs) but raises the false-alarm rate from 0.04 to 0.63, and the surviving false alarms are confidently wrong rather than unsupported. A reverse-direction pass that audits code against the rules recovers the scope creep retrieval cannot see, raising recall on it from 0.17 to 0.78. We conclude that evidence citation alone cannot make an LLM conformance judge trustworthy and that its counterexamples must be executed.</w:t>
       </w:r>
     </w:p>
     <w:p>
@@ -333,7 +333,7 @@
         <w:pStyle w:val="bulletlist"/>
       </w:pPr>
       <w:r>
-        <w:t>SpecGuard, a two-stage detector whose rule-retrieval and semantic-verification stages are instrumented independently, so that every miss is attributed either to the code never being shown or to the model reading it wrongly.</w:t>
+        <w:t>SpecGuard, a two-stage detector whose rule-retrieval and semantic-verification stages are instrumented independently, so that every miss is attributed either to the code never being shown or to the model reading it wrongly, together with a reverse-direction pass that audits every function against the whole specification for behaviour no rule authorises.</w:t>
       </w:r>
     </w:p>
     <w:p>
@@ -2512,6 +2512,30 @@
         <w:pStyle w:val="Heading2"/>
       </w:pPr>
       <w:r>
+        <w:t>The Reverse-Direction Pass</w:t>
+      </w:r>
+    </w:p>
+    <w:p>
+      <w:pPr>
+        <w:pStyle w:val="BodyText"/>
+      </w:pPr>
+      <w:r>
+        <w:t>Retrieval cannot see unauthorised scope creep, for the structural reason discussed with the retrieval results. The reverse pass inverts the direction. For every function and method it shows the model the entire rule list with that one excerpt and asks whether everything the function does is described by, or presupposed by, some rule. The model must first name the rules the function serves; a function that serves a rule and adds nothing is authorised, including the helpers and accessors a rule's behaviour depends on, and the absence of a check is explicitly not a finding.</w:t>
+      </w:r>
+    </w:p>
+    <w:p>
+      <w:pPr>
+        <w:pStyle w:val="BodyText"/>
+      </w:pPr>
+      <w:r>
+        <w:t>Two mechanical safeguards mirror the evidence gate. An UNAUTHORISED finding must quote, verbatim, the code that carries out the extra behaviour; a quote absent from the function is downgraded to UNCERTAIN, and the quote's true line numbers become the evidence. And a function byte-identical to one already reported on the pristine project is treated as accepted, as a static-analysis baseline file would, because real specifications omit things and the checker would otherwise report the same gap on every case. On the three pristine projects the first wording of the prompt flagged 11 of 31 functions and the second flagged 3, mostly on the ground that a method had no checks; the prompt was adjusted once on that evidence and not on the D8 cases.</w:t>
+      </w:r>
+    </w:p>
+    <w:p>
+      <w:pPr>
+        <w:pStyle w:val="Heading2"/>
+      </w:pPr>
+      <w:r>
         <w:t>Baselines</w:t>
       </w:r>
     </w:p>
@@ -2568,7 +2592,7 @@
         <w:pStyle w:val="bulletlist"/>
       </w:pPr>
       <w:r>
-        <w:t>D8 cases name no target rule, since no rule authorises the added behaviour, so a drift flag counts as a catch only if it was raised while the detector was shown the planted code, or cites its file; a flag raised elsewhere is spurious.</w:t>
+        <w:t>D8 cases name no target rule, since no rule authorises the added behaviour, so a drift flag counts as a catch only if it was raised while the detector was shown the planted code, or cites its file; a flag raised elsewhere is spurious. A reverse-direction finding names no rule and is treated alike: it counts on a D8 case when raised on the planted code, is spurious on any other drift case, and is a false alarm on a negative control.</w:t>
       </w:r>
     </w:p>
     <w:p>
@@ -2687,7 +2711,7 @@
         <w:pStyle w:val="BodyText"/>
       </w:pPr>
       <w:r>
-        <w:t>The weakest category is D8 at 0.33, and the reason is structural rather than incidental. Retrieval ranks code by similarity to a rule; code that no rule authorises is, by construction, similar to no rule. Reverse-direction drift will need an authorisation pass that iterates over code looking for rules, rather than over rules looking for code. Omitted checks at 0.50 are the second weakest, for the related reason that deleted code leaves nothing behind to retrieve.</w:t>
+        <w:t>The weakest category is D8 at 0.33, and the reason is structural rather than incidental. Retrieval ranks code by similarity to a rule; code that no rule authorises is, by construction, similar to no rule. Reverse-direction drift therefore needs an authorisation pass that iterates over code looking for rules, rather than over rules looking for code, which is what the reverse pass described earlier does. Omitted checks at 0.50 are the second weakest, for the related reason that deleted code leaves nothing behind to retrieve.</w:t>
       </w:r>
     </w:p>
     <w:p>
@@ -3117,11 +3141,255 @@
           <w:p>
             <w:pPr>
               <w:pStyle w:val="tablecopy"/>
+              <w:keepNext/>
+              <w:jc w:val="left"/>
+            </w:pPr>
+            <w:r>
+              <w:t>Keyword</w:t>
+            </w:r>
+          </w:p>
+        </w:tc>
+        <w:tc>
+          <w:tcPr>
+            <w:tcW w:type="dxa" w:w="432"/>
+          </w:tcPr>
+          <w:p>
+            <w:pPr>
+              <w:pStyle w:val="tablecopy"/>
+              <w:keepNext/>
+              <w:jc w:val="center"/>
+            </w:pPr>
+            <w:r>
+              <w:t>0.33</w:t>
+            </w:r>
+          </w:p>
+        </w:tc>
+        <w:tc>
+          <w:tcPr>
+            <w:tcW w:type="dxa" w:w="432"/>
+          </w:tcPr>
+          <w:p>
+            <w:pPr>
+              <w:pStyle w:val="tablecopy"/>
+              <w:keepNext/>
+              <w:jc w:val="center"/>
+            </w:pPr>
+            <w:r>
+              <w:t>0.16</w:t>
+            </w:r>
+          </w:p>
+        </w:tc>
+        <w:tc>
+          <w:tcPr>
+            <w:tcW w:type="dxa" w:w="432"/>
+          </w:tcPr>
+          <w:p>
+            <w:pPr>
+              <w:pStyle w:val="tablecopy"/>
+              <w:keepNext/>
+              <w:jc w:val="center"/>
+            </w:pPr>
+            <w:r>
+              <w:t>0.08</w:t>
+            </w:r>
+          </w:p>
+        </w:tc>
+        <w:tc>
+          <w:tcPr>
+            <w:tcW w:type="dxa" w:w="432"/>
+          </w:tcPr>
+          <w:p>
+            <w:pPr>
+              <w:pStyle w:val="tablecopy"/>
+              <w:keepNext/>
+              <w:jc w:val="center"/>
+            </w:pPr>
+            <w:r>
+              <w:t>0.14</w:t>
+            </w:r>
+          </w:p>
+        </w:tc>
+        <w:tc>
+          <w:tcPr>
+            <w:tcW w:type="dxa" w:w="518"/>
+          </w:tcPr>
+          <w:p>
+            <w:pPr>
+              <w:pStyle w:val="tablecopy"/>
+              <w:keepNext/>
+              <w:jc w:val="center"/>
+            </w:pPr>
+            <w:r>
+              <w:t>0.37</w:t>
+            </w:r>
+          </w:p>
+        </w:tc>
+        <w:tc>
+          <w:tcPr>
+            <w:tcW w:type="dxa" w:w="518"/>
+          </w:tcPr>
+          <w:p>
+            <w:pPr>
+              <w:pStyle w:val="tablecopy"/>
+              <w:keepNext/>
+              <w:jc w:val="center"/>
+            </w:pPr>
+            <w:r>
+              <w:t>0.00</w:t>
+            </w:r>
+          </w:p>
+        </w:tc>
+        <w:tc>
+          <w:tcPr>
+            <w:tcW w:type="dxa" w:w="518"/>
+          </w:tcPr>
+          <w:p>
+            <w:pPr>
+              <w:pStyle w:val="tablecopy"/>
+              <w:keepNext/>
+              <w:jc w:val="center"/>
+            </w:pPr>
+            <w:r>
+              <w:t>0</w:t>
+            </w:r>
+          </w:p>
+        </w:tc>
+      </w:tr>
+      <w:tr>
+        <w:tc>
+          <w:tcPr>
+            <w:tcW w:type="dxa" w:w="1152"/>
+          </w:tcPr>
+          <w:p>
+            <w:pPr>
+              <w:pStyle w:val="tablecopy"/>
+              <w:keepNext/>
+              <w:jc w:val="left"/>
+            </w:pPr>
+            <w:r>
+              <w:t>Reverse</w:t>
+            </w:r>
+          </w:p>
+        </w:tc>
+        <w:tc>
+          <w:tcPr>
+            <w:tcW w:type="dxa" w:w="432"/>
+          </w:tcPr>
+          <w:p>
+            <w:pPr>
+              <w:pStyle w:val="tablecopy"/>
+              <w:keepNext/>
+              <w:jc w:val="center"/>
+            </w:pPr>
+            <w:r>
+              <w:t>0.67</w:t>
+            </w:r>
+          </w:p>
+        </w:tc>
+        <w:tc>
+          <w:tcPr>
+            <w:tcW w:type="dxa" w:w="432"/>
+          </w:tcPr>
+          <w:p>
+            <w:pPr>
+              <w:pStyle w:val="tablecopy"/>
+              <w:keepNext/>
+              <w:jc w:val="center"/>
+            </w:pPr>
+            <w:r>
+              <w:t>0.27</w:t>
+            </w:r>
+          </w:p>
+        </w:tc>
+        <w:tc>
+          <w:tcPr>
+            <w:tcW w:type="dxa" w:w="432"/>
+          </w:tcPr>
+          <w:p>
+            <w:pPr>
+              <w:pStyle w:val="tablecopy"/>
+              <w:keepNext/>
+              <w:jc w:val="center"/>
+            </w:pPr>
+            <w:r>
+              <w:t>0.07</w:t>
+            </w:r>
+          </w:p>
+        </w:tc>
+        <w:tc>
+          <w:tcPr>
+            <w:tcW w:type="dxa" w:w="432"/>
+          </w:tcPr>
+          <w:p>
+            <w:pPr>
+              <w:pStyle w:val="tablecopy"/>
+              <w:keepNext/>
+              <w:jc w:val="center"/>
+            </w:pPr>
+            <w:r>
+              <w:t>0.12</w:t>
+            </w:r>
+          </w:p>
+        </w:tc>
+        <w:tc>
+          <w:tcPr>
+            <w:tcW w:type="dxa" w:w="518"/>
+          </w:tcPr>
+          <w:p>
+            <w:pPr>
+              <w:pStyle w:val="tablecopy"/>
+              <w:keepNext/>
+              <w:jc w:val="center"/>
+            </w:pPr>
+            <w:r>
+              <w:t>0.07</w:t>
+            </w:r>
+          </w:p>
+        </w:tc>
+        <w:tc>
+          <w:tcPr>
+            <w:tcW w:type="dxa" w:w="518"/>
+          </w:tcPr>
+          <w:p>
+            <w:pPr>
+              <w:pStyle w:val="tablecopy"/>
+              <w:keepNext/>
+              <w:jc w:val="center"/>
+            </w:pPr>
+            <w:r>
+              <w:t>0.00</w:t>
+            </w:r>
+          </w:p>
+        </w:tc>
+        <w:tc>
+          <w:tcPr>
+            <w:tcW w:type="dxa" w:w="518"/>
+          </w:tcPr>
+          <w:p>
+            <w:pPr>
+              <w:pStyle w:val="tablecopy"/>
+              <w:keepNext/>
+              <w:jc w:val="center"/>
+            </w:pPr>
+            <w:r>
+              <w:t>74</w:t>
+            </w:r>
+          </w:p>
+        </w:tc>
+      </w:tr>
+      <w:tr>
+        <w:tc>
+          <w:tcPr>
+            <w:tcW w:type="dxa" w:w="1152"/>
+          </w:tcPr>
+          <w:p>
+            <w:pPr>
+              <w:pStyle w:val="tablecopy"/>
               <w:keepNext w:val="0"/>
               <w:jc w:val="left"/>
             </w:pPr>
             <w:r>
-              <w:t>Keyword</w:t>
+              <w:t>Both</w:t>
             </w:r>
           </w:p>
         </w:tc>
@@ -3136,7 +3404,7 @@
               <w:jc w:val="center"/>
             </w:pPr>
             <w:r>
-              <w:t>0.33</w:t>
+              <w:t>0.66</w:t>
             </w:r>
           </w:p>
         </w:tc>
@@ -3151,7 +3419,7 @@
               <w:jc w:val="center"/>
             </w:pPr>
             <w:r>
-              <w:t>0.16</w:t>
+              <w:t>0.28</w:t>
             </w:r>
           </w:p>
         </w:tc>
@@ -3166,7 +3434,7 @@
               <w:jc w:val="center"/>
             </w:pPr>
             <w:r>
-              <w:t>0.08</w:t>
+              <w:t>0.59</w:t>
             </w:r>
           </w:p>
         </w:tc>
@@ -3181,7 +3449,7 @@
               <w:jc w:val="center"/>
             </w:pPr>
             <w:r>
-              <w:t>0.14</w:t>
+              <w:t>0.62</w:t>
             </w:r>
           </w:p>
         </w:tc>
@@ -3196,7 +3464,7 @@
               <w:jc w:val="center"/>
             </w:pPr>
             <w:r>
-              <w:t>0.37</w:t>
+              <w:t>0.67</w:t>
             </w:r>
           </w:p>
         </w:tc>
@@ -3211,7 +3479,7 @@
               <w:jc w:val="center"/>
             </w:pPr>
             <w:r>
-              <w:t>0.00</w:t>
+              <w:t>0.03</w:t>
             </w:r>
           </w:p>
         </w:tc>
@@ -3226,7 +3494,7 @@
               <w:jc w:val="center"/>
             </w:pPr>
             <w:r>
-              <w:t>0</w:t>
+              <w:t>326</w:t>
             </w:r>
           </w:p>
         </w:tc>
@@ -3329,6 +3597,22 @@
         <w:pStyle w:val="Heading2"/>
       </w:pPr>
       <w:r>
+        <w:t>Scope Creep and the Reverse Pass</w:t>
+      </w:r>
+    </w:p>
+    <w:p>
+      <w:pPr>
+        <w:pStyle w:val="BodyText"/>
+      </w:pPr>
+      <w:r>
+        <w:t>Table IV also reports the reverse pass, and Both is SpecGuard plus the reverse pass. Over three runs the reverse pass catches scope creep (D8) in 0.78 of cases, interval 0.44 to 1.00, against 0.17 (0.00 to 0.50) for forward SpecGuard, and on its own it is quiet: a false-alarm rate of 0.07 (0.00 to 0.17), two false alarms on 27 controls in run 1, both on benign-decoy controls whose planted comment makes ordinary code look suspicious. Its overall recall is 0.08 because it looks for one category only. Combined with SpecGuard it lifts overall recall from 0.54 to 0.61 (0.48 to 0.73), but the intervals overlap and the false-alarm rate stays SpecGuard's, since the forward pass supplies almost all of it. With six D8 cases the two D8 intervals touch between 0.44 and 0.50, so the gain is suggestive rather than conclusive. In run 1 the pass missed two of the six: a new method the model judged authorised, and an exemption for some clients hidden inside an existing method.</w:t>
+      </w:r>
+    </w:p>
+    <w:p>
+      <w:pPr>
+        <w:pStyle w:val="Heading2"/>
+      </w:pPr>
+      <w:r>
         <w:t>The False Alarms Are Confidently Wrong</w:t>
       </w:r>
     </w:p>
@@ -3449,7 +3733,7 @@
         <w:pStyle w:val="BodyText"/>
       </w:pPr>
       <w:r>
-        <w:t>Construct validity. SpecGuard results come from three runs of one model, gpt-4o-mini, at temperature zero; the baselines were run once, so their intervals reflect case sampling only. The host projects annotate code with the rule it implements, which real code does not. Stripping the annotations leaves the LLM detectors unchanged (SpecGuard recall 0.58 without them, 0.54 with, inside its interval) but raises the keyword baseline's false-alarm rate from 0.37 to 1.00, so that baseline's numbers are partly an artefact of the annotations. Drift labels are checked for the cases that matter: oracle tests confirm twelve of the thirteen escaping cases, and the thirteenth, a change of rounding mode the specification does not constrain, is retained as unconfirmed. Retrieval results use a deterministic local hashing embedder rather than a trained sentence encoder [8], [9], so Stage 1 numbers are a lower bound.</w:t>
+        <w:t>Construct validity. SpecGuard results come from three runs of one model, gpt-4o-mini, at temperature zero; the baselines were run once, so their intervals reflect case sampling only. The host projects annotate code with the rule it implements, which real code does not. Stripping the annotations leaves the LLM detectors unchanged (SpecGuard recall 0.58 without them, 0.54 with, inside its interval) but raises the keyword baseline's false-alarm rate from 0.37 to 1.00, so that baseline's numbers are partly an artefact of the annotations. Drift labels are checked for the cases that matter: oracle tests confirm twelve of the thirteen escaping cases, and the thirteenth, a change of rounding mode the specification does not constrain, is retained as unconfirmed. The reverse pass's prompt was adjusted once after observing what it flagged on the three pristine projects, which also supply the D8 cases, so its numbers are likely optimistic until a fourth project confirms them; it audits functions and methods only, so creep expressed as a module-level constant is out of reach. Retrieval results use a deterministic local hashing embedder rather than a trained sentence encoder [8], [9], so Stage 1 numbers are a lower bound.</w:t>
       </w:r>
     </w:p>
     <w:p>
@@ -3473,7 +3757,7 @@
         <w:pStyle w:val="BodyText"/>
       </w:pPr>
       <w:r>
-        <w:t>SpecDrift-Bench measures what the drift-detection literature has reported around: not how many issues a checker raises, but how many it misses, how many it invents, and in which categories. On 86 validated cases the answer for a retrieval-augmented LLM detector is a recall of 0.54 (interval 0.41 to 0.66) bought at a false-alarm rate of 0.63, with the remaining false alarms confidently argued rather than unsupported. Twenty-two percent of the injected drift passes the host projects' own tests, and unauthorised scope creep passes them always, so the problem the detector addresses is real even though the detector is not yet trustworthy.</w:t>
+        <w:t>SpecDrift-Bench measures what the drift-detection literature has reported around: not how many issues a checker raises, but how many it misses, how many it invents, and in which categories. On 86 validated cases the answer for a retrieval-augmented LLM detector is a recall of 0.54 (interval 0.41 to 0.66) bought at a false-alarm rate of 0.63, with the remaining false alarms confidently argued rather than unsupported. Twenty-two percent of the injected drift passes the host projects' own tests, and unauthorised scope creep passes them always, so the problem the detector addresses is real even though the detector is not yet trustworthy. A reverse pass from code to rules recovers the scope creep that retrieval structurally cannot see, lifting D8 recall from 0.17 to 0.78, though on six cases.</w:t>
       </w:r>
     </w:p>
     <w:p>
@@ -3481,7 +3765,7 @@
         <w:pStyle w:val="BodyText"/>
       </w:pPr>
       <w:r>
-        <w:t>Four extensions are scheduled, each with a slot already present in the framework. An adversarial second pass will execute the counterexample attached to every drift verdict and retain the verdict only if the code behaves as alleged, which directly targets the failure characterised in Section VI-D. A reverse-direction authorisation pass will iterate over code looking for an authorising rule, rather than over rules looking for code, which is the only way to lift D8 retrieval above 0.33. Repeated runs across model scales, with Semcheck added as a third baseline, will extend the repeated-run intervals to every detector. And confidence calibration will be measured to derive the abstention threshold that deployment requires. The benchmark will be expanded to ten host projects and approximately 250 cases over the same taxonomy.</w:t>
+        <w:t>Three extensions are scheduled, each with a slot already present in the framework. An adversarial second pass will execute the counterexample attached to every drift verdict and retain the verdict only if the code behaves as alleged, which directly targets the failure characterised in Section VI-D. Repeated runs across model scales, with Semcheck added as a third baseline, will extend the repeated-run intervals to every detector. And confidence calibration will be measured to derive the abstention threshold that deployment requires. The benchmark will be expanded to ten host projects and approximately 250 cases over the same taxonomy, which will also test the reverse pass on a project it was not tuned on.</w:t>
       </w:r>
     </w:p>
     <w:p>

</xml_diff>